<commit_message>
Fix mobile nav menu toggle, navigation links, overlay z-index, and contact page mobile responsive layout
</commit_message>
<xml_diff>
--- a/Firaol_Desalegn_CV.docx
+++ b/Firaol_Desalegn_CV.docx
@@ -21,12 +21,6 @@
         <w:gridCol w:w="2746"/>
       </w:tblGrid>
       <w:tr>
-        <w:tblPrEx>
-          <w:tblCellMar>
-            <w:top w:w="0" w:type="dxa"/>
-            <w:bottom w:w="0" w:type="dxa"/>
-          </w:tblCellMar>
-        </w:tblPrEx>
         <w:tc>
           <w:tcPr>
             <w:tcW w:w="7000" w:type="dxa"/>
@@ -227,13 +221,7 @@
         <w:rPr>
           <w:color w:val="555555"/>
         </w:rPr>
-        <w:t>Passionate about building cross-platform mobile app</w:t>
-      </w:r>
-      <w:r>
-        <w:rPr>
-          <w:color w:val="555555"/>
-        </w:rPr>
-        <w:t>lications using React Native and developing practical software solutions.</w:t>
+        <w:t>Passionate about building cross-platform mobile applications using React Native and developing practical software solutions.</w:t>
       </w:r>
       <w:proofErr w:type="gramEnd"/>
       <w:r>
@@ -417,13 +405,7 @@
         <w:rPr>
           <w:color w:val="555555"/>
         </w:rPr>
-        <w:t>Mobile App Development: React Native — passionate about b</w:t>
-      </w:r>
-      <w:r>
-        <w:rPr>
-          <w:color w:val="555555"/>
-        </w:rPr>
-        <w:t>uilding cross-platform mobile applications for Android and iOS</w:t>
+        <w:t>Mobile App Development: React Native — passionate about building cross-platform mobile applications for Android and iOS</w:t>
       </w:r>
     </w:p>
     <w:p>
@@ -455,13 +437,7 @@
         <w:rPr>
           <w:color w:val="555555"/>
         </w:rPr>
-        <w:t>Databases: SQL — designing and managing relational database</w:t>
-      </w:r>
-      <w:r>
-        <w:rPr>
-          <w:color w:val="555555"/>
-        </w:rPr>
-        <w:t>s</w:t>
+        <w:t>Databases: SQL — designing and managing relational databases</w:t>
       </w:r>
     </w:p>
     <w:p>
@@ -541,13 +517,7 @@
         <w:rPr>
           <w:color w:val="555555"/>
         </w:rPr>
-        <w:t>Practicing Python daily to deepen programming logic, problem-solving, and preparation for AI/M</w:t>
-      </w:r>
-      <w:r>
-        <w:rPr>
-          <w:color w:val="555555"/>
-        </w:rPr>
-        <w:t>L development</w:t>
+        <w:t>Practicing Python daily to deepen programming logic, problem-solving, and preparation for AI/ML development</w:t>
       </w:r>
     </w:p>
     <w:p>
@@ -677,13 +647,7 @@
         <w:rPr>
           <w:color w:val="555555"/>
         </w:rPr>
-        <w:t xml:space="preserve"> Features include book rec</w:t>
-      </w:r>
-      <w:r>
-        <w:rPr>
-          <w:color w:val="555555"/>
-        </w:rPr>
-        <w:t xml:space="preserve">ords, member registration, </w:t>
+        <w:t xml:space="preserve"> Features include book records, member registration, </w:t>
       </w:r>
       <w:proofErr w:type="gramStart"/>
       <w:r>
@@ -711,14 +675,10 @@
           <w:szCs w:val="21"/>
         </w:rPr>
       </w:pPr>
-      <w:bookmarkStart w:id="0" w:name="_GoBack"/>
-      <w:bookmarkEnd w:id="0"/>
     </w:p>
     <w:p>
       <w:pPr>
         <w:spacing w:before="100" w:after="30"/>
-      </w:pPr>
-      <w:r>
         <w:rPr>
           <w:b/>
           <w:bCs/>
@@ -726,6 +686,20 @@
           <w:sz w:val="21"/>
           <w:szCs w:val="21"/>
         </w:rPr>
+      </w:pPr>
+    </w:p>
+    <w:p>
+      <w:pPr>
+        <w:spacing w:before="100" w:after="30"/>
+      </w:pPr>
+      <w:r>
+        <w:rPr>
+          <w:b/>
+          <w:bCs/>
+          <w:color w:val="1A3557"/>
+          <w:sz w:val="21"/>
+          <w:szCs w:val="21"/>
+        </w:rPr>
         <w:lastRenderedPageBreak/>
         <w:t>Car Rental Management System</w:t>
       </w:r>
@@ -747,13 +721,7 @@
         <w:rPr>
           <w:color w:val="555555"/>
         </w:rPr>
-        <w:t xml:space="preserve"> The system handles v</w:t>
-      </w:r>
-      <w:r>
-        <w:rPr>
-          <w:color w:val="555555"/>
-        </w:rPr>
-        <w:t>ehicle inventory, customer records, rental transactions, and return processing with a structured console-based interface.</w:t>
+        <w:t xml:space="preserve"> The system handles vehicle inventory, customer records, rental transactions, and return processing with a structured console-based interface.</w:t>
       </w:r>
     </w:p>
     <w:p>
@@ -1131,8 +1099,13 @@
     </w:p>
     <w:p>
       <w:r>
-        <w:t>Portfolio: https://firayenate.github.io/firaportfolio</w:t>
-      </w:r>
+        <w:t xml:space="preserve">Portfolio: </w:t>
+      </w:r>
+      <w:bookmarkStart w:id="0" w:name="_GoBack"/>
+      <w:r>
+        <w:t>https://firayenate.github.io/firaportfolio</w:t>
+      </w:r>
+      <w:bookmarkEnd w:id="0"/>
     </w:p>
     <w:sectPr>
       <w:pgSz w:w="11906" w:h="16838"/>

</xml_diff>